<commit_message>
Improve job discovery and comparison workflow
</commit_message>
<xml_diff>
--- a/docs/reports/CareerFit_Final_Report_Draft.docx
+++ b/docs/reports/CareerFit_Final_Report_Draft.docx
@@ -1710,6 +1710,130 @@
           </w:p>
         </w:tc>
       </w:tr>
+      <w:tr>
+        <w:tc>
+          <w:tcPr>
+            <w:tcW w:type="dxa" w:w="3360"/>
+            <w:vAlign w:val="center"/>
+          </w:tcPr>
+          <w:p>
+            <w:pPr>
+              <w:jc w:val="left"/>
+            </w:pPr>
+            <w:r/>
+            <w:r>
+              <w:rPr>
+                <w:b w:val="0"/>
+                <w:color w:val="172033"/>
+                <w:sz w:val="16"/>
+              </w:rPr>
+              <w:t>FR-15</w:t>
+            </w:r>
+          </w:p>
+        </w:tc>
+        <w:tc>
+          <w:tcPr>
+            <w:tcW w:type="dxa" w:w="3360"/>
+            <w:vAlign w:val="center"/>
+          </w:tcPr>
+          <w:p>
+            <w:pPr>
+              <w:jc w:val="left"/>
+            </w:pPr>
+            <w:r/>
+            <w:r>
+              <w:rPr>
+                <w:b w:val="0"/>
+                <w:color w:val="172033"/>
+                <w:sz w:val="16"/>
+              </w:rPr>
+              <w:t>Suggest related job titles and show posting freshness where provider dates are available</w:t>
+            </w:r>
+          </w:p>
+        </w:tc>
+        <w:tc>
+          <w:tcPr>
+            <w:tcW w:type="dxa" w:w="3360"/>
+            <w:vAlign w:val="center"/>
+          </w:tcPr>
+          <w:p>
+            <w:pPr>
+              <w:jc w:val="left"/>
+            </w:pPr>
+            <w:r/>
+            <w:r>
+              <w:rPr>
+                <w:b w:val="0"/>
+                <w:color w:val="172033"/>
+                <w:sz w:val="16"/>
+              </w:rPr>
+              <w:t>Implemented</w:t>
+            </w:r>
+          </w:p>
+        </w:tc>
+      </w:tr>
+      <w:tr>
+        <w:tc>
+          <w:tcPr>
+            <w:tcW w:type="dxa" w:w="3360"/>
+            <w:vAlign w:val="center"/>
+          </w:tcPr>
+          <w:p>
+            <w:pPr>
+              <w:jc w:val="left"/>
+            </w:pPr>
+            <w:r/>
+            <w:r>
+              <w:rPr>
+                <w:b w:val="0"/>
+                <w:color w:val="172033"/>
+                <w:sz w:val="16"/>
+              </w:rPr>
+              <w:t>FR-16</w:t>
+            </w:r>
+          </w:p>
+        </w:tc>
+        <w:tc>
+          <w:tcPr>
+            <w:tcW w:type="dxa" w:w="3360"/>
+            <w:vAlign w:val="center"/>
+          </w:tcPr>
+          <w:p>
+            <w:pPr>
+              <w:jc w:val="left"/>
+            </w:pPr>
+            <w:r/>
+            <w:r>
+              <w:rPr>
+                <w:b w:val="0"/>
+                <w:color w:val="172033"/>
+                <w:sz w:val="16"/>
+              </w:rPr>
+              <w:t>Exclude unsuitable keywords and compare up to three postings side by side</w:t>
+            </w:r>
+          </w:p>
+        </w:tc>
+        <w:tc>
+          <w:tcPr>
+            <w:tcW w:type="dxa" w:w="3360"/>
+            <w:vAlign w:val="center"/>
+          </w:tcPr>
+          <w:p>
+            <w:pPr>
+              <w:jc w:val="left"/>
+            </w:pPr>
+            <w:r/>
+            <w:r>
+              <w:rPr>
+                <w:b w:val="0"/>
+                <w:color w:val="172033"/>
+                <w:sz w:val="16"/>
+              </w:rPr>
+              <w:t>Implemented</w:t>
+            </w:r>
+          </w:p>
+        </w:tc>
+      </w:tr>
     </w:tbl>
     <w:p/>
     <w:p>
@@ -4184,6 +4308,11 @@
     <w:p>
       <w:r>
         <w:t>This feature is intentionally lightweight. It is not a permanent labor-market database. Instead, it provides a transparent summary of the currently retrieved sample.</w:t>
+      </w:r>
+    </w:p>
+    <w:p>
+      <w:r>
+        <w:t>The discovery workflow also provides related-role suggestions. Suggestions combine a small transparent role map with distinct titles found in the current result set. Posting timestamps from providers are normalized when available and shown as freshness badges. Users can enter comma-separated excluded keywords and compare up to three result cards side by side before deciding which role deserves a full readiness report.</w:t>
       </w:r>
     </w:p>
     <w:p>
@@ -6574,7 +6703,7 @@
                 <w:color w:val="172033"/>
                 <w:sz w:val="16"/>
               </w:rPr>
-              <w:t>Import URL, search, filters, role insights, results, selected-job panel</w:t>
+              <w:t>Import URL, search, filters, exclusions, related roles, freshness, comparison table, results, selected-job panel</w:t>
             </w:r>
           </w:p>
         </w:tc>
@@ -12096,7 +12225,7 @@
                 <w:color w:val="172033"/>
                 <w:sz w:val="16"/>
               </w:rPr>
-              <w:t>Filters: workplace | skills | experience | employment | salary</w:t>
+              <w:t>Filters: workplace | skills | exclude keywords | experience | employment | salary</w:t>
             </w:r>
           </w:p>
         </w:tc>
@@ -12160,7 +12289,7 @@
                 <w:color w:val="172033"/>
                 <w:sz w:val="16"/>
               </w:rPr>
-              <w:t>Role insights: recurring skills across retrieved postings</w:t>
+              <w:t>Role insights: recurring skills | related role suggestions</w:t>
             </w:r>
           </w:p>
         </w:tc>
@@ -12244,7 +12373,7 @@
                 <w:color w:val="172033"/>
                 <w:sz w:val="16"/>
               </w:rPr>
-              <w:t>Job cards: company | location | salary | source</w:t>
+              <w:t>Job cards: company | location | salary | source | freshness</w:t>
             </w:r>
           </w:p>
         </w:tc>
@@ -12330,6 +12459,70 @@
                 <w:sz w:val="16"/>
               </w:rPr>
               <w:t>Quick match | readiness | skills</w:t>
+            </w:r>
+          </w:p>
+        </w:tc>
+      </w:tr>
+      <w:tr>
+        <w:tc>
+          <w:tcPr>
+            <w:tcW w:type="dxa" w:w="3360"/>
+            <w:vAlign w:val="center"/>
+            <w:shd w:fill="F8FAFC"/>
+          </w:tcPr>
+          <w:p>
+            <w:pPr>
+              <w:jc w:val="left"/>
+            </w:pPr>
+            <w:r/>
+            <w:r>
+              <w:rPr>
+                <w:b w:val="0"/>
+                <w:color w:val="172033"/>
+                <w:sz w:val="16"/>
+              </w:rPr>
+              <w:t>COMPARE UP TO 3 JOBS</w:t>
+            </w:r>
+          </w:p>
+        </w:tc>
+        <w:tc>
+          <w:tcPr>
+            <w:tcW w:type="dxa" w:w="3360"/>
+            <w:vAlign w:val="center"/>
+            <w:shd w:fill="F8FAFC"/>
+          </w:tcPr>
+          <w:p>
+            <w:pPr>
+              <w:jc w:val="left"/>
+            </w:pPr>
+            <w:r/>
+            <w:r>
+              <w:rPr>
+                <w:b w:val="0"/>
+                <w:color w:val="172033"/>
+                <w:sz w:val="16"/>
+              </w:rPr>
+              <w:t>Side-by-side role | company | salary | workplace | freshness</w:t>
+            </w:r>
+          </w:p>
+        </w:tc>
+        <w:tc>
+          <w:tcPr>
+            <w:tcW w:type="dxa" w:w="3360"/>
+            <w:vAlign w:val="center"/>
+            <w:shd w:fill="F8FAFC"/>
+          </w:tcPr>
+          <w:p>
+            <w:pPr>
+              <w:jc w:val="left"/>
+            </w:pPr>
+            <w:r/>
+            <w:r>
+              <w:rPr>
+                <w:b w:val="0"/>
+                <w:color w:val="172033"/>
+                <w:sz w:val="16"/>
+              </w:rPr>
             </w:r>
           </w:p>
         </w:tc>

</xml_diff>